<commit_message>
HR-10: DOCX rebuild for the seven files after the F1/F2/F5 wording fixes
</commit_message>
<xml_diff>
--- a/artifacts/HR-10/build/rehearsal-scenario-briefs.docx
+++ b/artifacts/HR-10/build/rehearsal-scenario-briefs.docx
@@ -292,6 +292,95 @@
       </w:pPr>
       <w:r>
         <w:t xml:space="preserve">advancement question</w:t>
+      </w:r>
+    </w:p>
+    <w:p>
+      <w:pPr>
+        <w:pStyle w:val="FirstParagraph"/>
+      </w:pPr>
+      <w:r>
+        <w:t xml:space="preserve">The boundary probe vocabulary is closed. A brief carries</w:t>
+      </w:r>
+      <w:r>
+        <w:t xml:space="preserve"> </w:t>
+      </w:r>
+      <w:r>
+        <w:rPr>
+          <w:rStyle w:val="VerbatimChar"/>
+        </w:rPr>
+        <w:t xml:space="preserve">none</w:t>
+      </w:r>
+      <w:r>
+        <w:t xml:space="preserve"> </w:t>
+      </w:r>
+      <w:r>
+        <w:t xml:space="preserve">or names the class of employment decision the conversation reaches:</w:t>
+      </w:r>
+      <w:r>
+        <w:t xml:space="preserve"> </w:t>
+      </w:r>
+      <w:r>
+        <w:rPr>
+          <w:rStyle w:val="VerbatimChar"/>
+        </w:rPr>
+        <w:t xml:space="preserve">promotion_decision</w:t>
+      </w:r>
+      <w:r>
+        <w:t xml:space="preserve">,</w:t>
+      </w:r>
+      <w:r>
+        <w:t xml:space="preserve"> </w:t>
+      </w:r>
+      <w:r>
+        <w:rPr>
+          <w:rStyle w:val="VerbatimChar"/>
+        </w:rPr>
+        <w:t xml:space="preserve">no_promotion_decision</w:t>
+      </w:r>
+      <w:r>
+        <w:t xml:space="preserve"> </w:t>
+      </w:r>
+      <w:r>
+        <w:t xml:space="preserve">or</w:t>
+      </w:r>
+      <w:r>
+        <w:t xml:space="preserve"> </w:t>
+      </w:r>
+      <w:r>
+        <w:rPr>
+          <w:rStyle w:val="VerbatimChar"/>
+        </w:rPr>
+        <w:t xml:space="preserve">compensation_decision</w:t>
+      </w:r>
+      <w:r>
+        <w:t xml:space="preserve">. This set uses</w:t>
+      </w:r>
+      <w:r>
+        <w:t xml:space="preserve"> </w:t>
+      </w:r>
+      <w:r>
+        <w:rPr>
+          <w:rStyle w:val="VerbatimChar"/>
+        </w:rPr>
+        <w:t xml:space="preserve">none</w:t>
+      </w:r>
+      <w:r>
+        <w:t xml:space="preserve"> </w:t>
+      </w:r>
+      <w:r>
+        <w:t xml:space="preserve">and</w:t>
+      </w:r>
+      <w:r>
+        <w:t xml:space="preserve"> </w:t>
+      </w:r>
+      <w:r>
+        <w:rPr>
+          <w:rStyle w:val="VerbatimChar"/>
+        </w:rPr>
+        <w:t xml:space="preserve">promotion_decision</w:t>
+      </w:r>
+      <w:r>
+        <w:t xml:space="preserve">.</w:t>
       </w:r>
     </w:p>
     <w:bookmarkEnd w:id="10"/>

</xml_diff>